<commit_message>
fix: починить {%tr for/endfor %} в supply_appendix_2.docx
docxtpl regex жадный — при наличии for и endfor в одной строке
захватывает ПОСЛЕДНИЙ {%tr}, игнорируя первый. Единственное решение —
разбить один ряд на три: маркер-for / шаблон содержимого / маркер-endfor.

Co-Authored-By: Claude Sonnet 4.6 <noreply@anthropic.com>
</commit_message>
<xml_diff>
--- a/templates/contracts/supply_appendix_2.docx
+++ b/templates/contracts/supply_appendix_2.docx
@@ -1282,6 +1282,24 @@
         <w:tc>
           <w:tcPr>
             <w:tcW w:w="7626" w:type="dxa"/>
+          </w:tcPr>
+          <w:p>
+            <w:r>
+              <w:t>{%tr for item in kit_rows %}</w:t>
+            </w:r>
+          </w:p>
+        </w:tc>
+        <w:tc>
+          <w:tcPr>
+            <w:tcW w:w="2445" w:type="dxa"/>
+          </w:tcPr>
+          <w:p/>
+        </w:tc>
+      </w:tr>
+      <w:tr>
+        <w:tc>
+          <w:tcPr>
+            <w:tcW w:w="7626" w:type="dxa"/>
             <w:tcBorders>
               <w:left w:val="single" w:sz="2" w:space="0" w:color="000001"/>
               <w:bottom w:val="single" w:sz="2" w:space="0" w:color="000001"/>
@@ -1306,7 +1324,7 @@
                 <w:sz w:val="22"/>
                 <w:szCs w:val="22"/>
               </w:rPr>
-              <w:t>{%tr for item in kit_rows %}{{item.name}}</w:t>
+              <w:t>{{item.name}}</w:t>
             </w:r>
           </w:p>
         </w:tc>
@@ -1338,7 +1356,25 @@
                 <w:sz w:val="22"/>
                 <w:szCs w:val="22"/>
               </w:rPr>
-              <w:t>{{item.qty}}{%tr endfor %}</w:t>
+              <w:t>{{item.qty}}</w:t>
+            </w:r>
+          </w:p>
+        </w:tc>
+      </w:tr>
+      <w:tr>
+        <w:tc>
+          <w:tcPr>
+            <w:tcW w:w="7626" w:type="dxa"/>
+          </w:tcPr>
+          <w:p/>
+        </w:tc>
+        <w:tc>
+          <w:tcPr>
+            <w:tcW w:w="2445" w:type="dxa"/>
+          </w:tcPr>
+          <w:p>
+            <w:r>
+              <w:t>{%tr endfor %}</w:t>
             </w:r>
           </w:p>
         </w:tc>

</xml_diff>